<commit_message>
Mise à jour du rapport RMarkdown
</commit_message>
<xml_diff>
--- a/rapport_ameliore.docx
+++ b/rapport_ameliore.docx
@@ -1874,7 +1874,7 @@
     </w:p>
     <w:bookmarkEnd w:id="15"/>
     <w:bookmarkEnd w:id="16"/>
-    <w:bookmarkStart w:id="21" w:name="analyse-exploratoire-des-données"/>
+    <w:bookmarkStart w:id="22" w:name="analyse-exploratoire-des-données"/>
     <w:p>
       <w:pPr>
         <w:pStyle w:val="Heading1"/>
@@ -1883,7 +1883,7 @@
         <w:t xml:space="preserve">Analyse Exploratoire des Données</w:t>
       </w:r>
     </w:p>
-    <w:bookmarkStart w:id="20" w:name="vérification-des-doublons"/>
+    <w:bookmarkStart w:id="17" w:name="vérification-des-doublons"/>
     <w:p>
       <w:pPr>
         <w:pStyle w:val="Heading2"/>
@@ -1939,11 +1939,15 @@
       <w:r>
         <w:t xml:space="preserve">L’exécution de la fonction duplicated() sur l’ensemble du jeu de données retourne 0 doublon. Chaque ligne correspond à un individu distinct. Le jeu de données ne nécessite donc aucune suppression d’observations pour cause de redondance.</w:t>
       </w:r>
-      <w:r>
-        <w:t xml:space="preserve"> </w:t>
-      </w:r>
-      <w:r>
-        <w:t xml:space="preserve">## Valeurs manquantes</w:t>
+    </w:p>
+    <w:bookmarkEnd w:id="17"/>
+    <w:bookmarkStart w:id="21" w:name="valeurs-manquantes"/>
+    <w:p>
+      <w:pPr>
+        <w:pStyle w:val="Heading2"/>
+      </w:pPr>
+      <w:r>
+        <w:t xml:space="preserve">Valeurs manquantes</w:t>
       </w:r>
     </w:p>
     <w:p>
@@ -2093,18 +2097,18 @@
           <wp:inline>
             <wp:extent cx="5334000" cy="3333750"/>
             <wp:effectExtent b="0" l="0" r="0" t="0"/>
-            <wp:docPr descr="" title="" id="18" name="Picture"/>
+            <wp:docPr descr="" title="" id="19" name="Picture"/>
             <a:graphic>
               <a:graphicData uri="http://schemas.openxmlformats.org/drawingml/2006/picture">
                 <pic:pic>
                   <pic:nvPicPr>
-                    <pic:cNvPr descr="rapport_ameliore_files/rapport_ameliore_files/figure-docx/missing-values-1.png" id="19" name="Picture"/>
+                    <pic:cNvPr descr="rapport_ameliore_files/rapport_ameliore_files/figure-docx/missing-values-1.png" id="20" name="Picture"/>
                     <pic:cNvPicPr>
                       <a:picLocks noChangeArrowheads="1" noChangeAspect="1"/>
                     </pic:cNvPicPr>
                   </pic:nvPicPr>
                   <pic:blipFill>
-                    <a:blip r:embed="rId17"/>
+                    <a:blip r:embed="rId18"/>
                     <a:stretch>
                       <a:fillRect/>
                     </a:stretch>
@@ -2139,9 +2143,9 @@
         <w:t xml:space="preserve">L’application de colSums(is.na(data)) confirme l’absence totale de valeurs manquantes dans toutes les variables. La visualisation produite par vis_miss() affiche un taux de complétude de 100%, représenté par une carte entièrement bleue sans aucune zone grise. Le jeu de données est donc directement exploitable pour les analyses statistiques sans nécessiter d’imputation.</w:t>
       </w:r>
     </w:p>
-    <w:bookmarkEnd w:id="20"/>
     <w:bookmarkEnd w:id="21"/>
-    <w:bookmarkStart w:id="23" w:name="X9a4b39e9a62a212998ab7d1e670f30b33dfe964"/>
+    <w:bookmarkEnd w:id="22"/>
+    <w:bookmarkStart w:id="24" w:name="X9a4b39e9a62a212998ab7d1e670f30b33dfe964"/>
     <w:p>
       <w:pPr>
         <w:pStyle w:val="Heading1"/>
@@ -3145,7 +3149,7 @@
         <w:t xml:space="preserve">La variable sit_ups_count présente le nombre le plus élevé d’outliers (47), ce qui traduit une forte hétérogénéité de l’endurance abdominale dans la population étudiée. Ces valeurs ne constituent pas nécessairement des erreurs de mesure, mais reflètent la diversité réelle des profils physiques.</w:t>
       </w:r>
     </w:p>
-    <w:bookmarkStart w:id="22" w:name="correction-des-valeurs-aberrantes"/>
+    <w:bookmarkStart w:id="23" w:name="correction-des-valeurs-aberrantes"/>
     <w:p>
       <w:pPr>
         <w:pStyle w:val="Heading2"/>
@@ -3821,9 +3825,9 @@
         <w:t xml:space="preserve">}</w:t>
       </w:r>
     </w:p>
-    <w:bookmarkEnd w:id="22"/>
     <w:bookmarkEnd w:id="23"/>
-    <w:bookmarkStart w:id="42" w:name="analyse-de-la-distribution-des-variables"/>
+    <w:bookmarkEnd w:id="24"/>
+    <w:bookmarkStart w:id="43" w:name="analyse-de-la-distribution-des-variables"/>
     <w:p>
       <w:pPr>
         <w:pStyle w:val="Heading1"/>
@@ -4571,18 +4575,18 @@
           <wp:inline>
             <wp:extent cx="5334000" cy="3333750"/>
             <wp:effectExtent b="0" l="0" r="0" t="0"/>
-            <wp:docPr descr="" title="" id="25" name="Picture"/>
+            <wp:docPr descr="" title="" id="26" name="Picture"/>
             <a:graphic>
               <a:graphicData uri="http://schemas.openxmlformats.org/drawingml/2006/picture">
                 <pic:pic>
                   <pic:nvPicPr>
-                    <pic:cNvPr descr="rapport_ameliore_files/rapport_ameliore_files/figure-docx/distribution-1.png" id="26" name="Picture"/>
+                    <pic:cNvPr descr="rapport_ameliore_files/rapport_ameliore_files/figure-docx/distribution-1.png" id="27" name="Picture"/>
                     <pic:cNvPicPr>
                       <a:picLocks noChangeArrowheads="1" noChangeAspect="1"/>
                     </pic:cNvPicPr>
                   </pic:nvPicPr>
                   <pic:blipFill>
-                    <a:blip r:embed="rId24"/>
+                    <a:blip r:embed="rId25"/>
                     <a:stretch>
                       <a:fillRect/>
                     </a:stretch>
@@ -4665,18 +4669,18 @@
           <wp:inline>
             <wp:extent cx="5334000" cy="3333750"/>
             <wp:effectExtent b="0" l="0" r="0" t="0"/>
-            <wp:docPr descr="" title="" id="28" name="Picture"/>
+            <wp:docPr descr="" title="" id="29" name="Picture"/>
             <a:graphic>
               <a:graphicData uri="http://schemas.openxmlformats.org/drawingml/2006/picture">
                 <pic:pic>
                   <pic:nvPicPr>
-                    <pic:cNvPr descr="rapport_ameliore_files/rapport_ameliore_files/figure-docx/distribution-2.png" id="29" name="Picture"/>
+                    <pic:cNvPr descr="rapport_ameliore_files/rapport_ameliore_files/figure-docx/distribution-2.png" id="30" name="Picture"/>
                     <pic:cNvPicPr>
                       <a:picLocks noChangeArrowheads="1" noChangeAspect="1"/>
                     </pic:cNvPicPr>
                   </pic:nvPicPr>
                   <pic:blipFill>
-                    <a:blip r:embed="rId27"/>
+                    <a:blip r:embed="rId28"/>
                     <a:stretch>
                       <a:fillRect/>
                     </a:stretch>
@@ -4759,18 +4763,18 @@
           <wp:inline>
             <wp:extent cx="5334000" cy="3333750"/>
             <wp:effectExtent b="0" l="0" r="0" t="0"/>
-            <wp:docPr descr="" title="" id="31" name="Picture"/>
+            <wp:docPr descr="" title="" id="32" name="Picture"/>
             <a:graphic>
               <a:graphicData uri="http://schemas.openxmlformats.org/drawingml/2006/picture">
                 <pic:pic>
                   <pic:nvPicPr>
-                    <pic:cNvPr descr="rapport_ameliore_files/rapport_ameliore_files/figure-docx/distribution-3.png" id="32" name="Picture"/>
+                    <pic:cNvPr descr="rapport_ameliore_files/rapport_ameliore_files/figure-docx/distribution-3.png" id="33" name="Picture"/>
                     <pic:cNvPicPr>
                       <a:picLocks noChangeArrowheads="1" noChangeAspect="1"/>
                     </pic:cNvPicPr>
                   </pic:nvPicPr>
                   <pic:blipFill>
-                    <a:blip r:embed="rId30"/>
+                    <a:blip r:embed="rId31"/>
                     <a:stretch>
                       <a:fillRect/>
                     </a:stretch>
@@ -4853,18 +4857,18 @@
           <wp:inline>
             <wp:extent cx="5334000" cy="3333750"/>
             <wp:effectExtent b="0" l="0" r="0" t="0"/>
-            <wp:docPr descr="" title="" id="34" name="Picture"/>
+            <wp:docPr descr="" title="" id="35" name="Picture"/>
             <a:graphic>
               <a:graphicData uri="http://schemas.openxmlformats.org/drawingml/2006/picture">
                 <pic:pic>
                   <pic:nvPicPr>
-                    <pic:cNvPr descr="rapport_ameliore_files/rapport_ameliore_files/figure-docx/distribution-4.png" id="35" name="Picture"/>
+                    <pic:cNvPr descr="rapport_ameliore_files/rapport_ameliore_files/figure-docx/distribution-4.png" id="36" name="Picture"/>
                     <pic:cNvPicPr>
                       <a:picLocks noChangeArrowheads="1" noChangeAspect="1"/>
                     </pic:cNvPicPr>
                   </pic:nvPicPr>
                   <pic:blipFill>
-                    <a:blip r:embed="rId33"/>
+                    <a:blip r:embed="rId34"/>
                     <a:stretch>
                       <a:fillRect/>
                     </a:stretch>
@@ -4949,19 +4953,53 @@
         <w:t xml:space="preserve"> </w:t>
       </w:r>
       <w:r>
-        <w:t xml:space="preserve">hand_grip_strength_kg et sit_ups_count — La p-value est extrêmement faible (respectivement 7.62×10⁻⁸ et 7.36×10⁻⁹), bien inférieure au seuil de 0.05. L’hypothèse de normalité est donc rejetée pour ces deux variables. La force de préhension est influencée par la dualité hommes/femmes, tandis que l’endurance abdominale présente une distribution concentrée avec des valeurs extrêmes importantes (47 outliers détectés).</w:t>
-      </w:r>
-      <w:r>
-        <w:t xml:space="preserve"> </w:t>
-      </w:r>
-      <w:r>
-        <w:t xml:space="preserve">sit_and_reach_cm et vo2_estimate_ml_per_kg_min — Les p-values sont très élevées (0.441 et 0.948), largement supérieures à 0.05. L’hypothèse de normalité ne peut pas être rejetée pour ces deux variables, ce qui est confirmé visuellement par la distribution quasi-gaussienne du VO₂ max.</w:t>
-      </w:r>
-      <w:r>
-        <w:t xml:space="preserve"> </w:t>
-      </w:r>
-      <w:r>
-        <w:t xml:space="preserve">Conclusion générale : La normalité est vérifiée pour la flexibilité et la capacité aérobie, mais rejetée pour la force musculaire et l’endurance abdominale. Ce résultat ne remet pas en cause l’utilisation de l’ACP, qui est une méthode robuste ne supposant pas la normalité stricte des données. Cependant, la non-normalité de certaines variables devra être prise en compte lors de l’interprétation des axes factoriels et des profils de clusters.</w:t>
+        <w:t xml:space="preserve">hand_grip_strength_kg et sit_ups_count* — les p-values sont extrêmement faibles (respectivement 7.62×10⁻⁸ et 3.69×10⁻¹¹), bien inférieures au seuil de 0.05. L’hypothèse de normalité est rejetée pour ces deux variables.</w:t>
+      </w:r>
+      <w:r>
+        <w:rPr>
+          <w:i/>
+          <w:iCs/>
+        </w:rPr>
+        <w:t xml:space="preserve"> </w:t>
+      </w:r>
+      <w:r>
+        <w:rPr>
+          <w:i/>
+          <w:iCs/>
+        </w:rPr>
+        <w:t xml:space="preserve">sit_and_reach_cm</w:t>
+      </w:r>
+      <w:r>
+        <w:t xml:space="preserve"> </w:t>
+      </w:r>
+      <w:r>
+        <w:t xml:space="preserve">— la p-value (0.049) est marginalement inférieure à 0.05. La normalité est donc rejetée, bien que la statistique W = 0.998 soit très proche de 1, indiquant une distribution quasi-normale.</w:t>
+      </w:r>
+      <w:r>
+        <w:rPr>
+          <w:i/>
+          <w:iCs/>
+        </w:rPr>
+        <w:t xml:space="preserve"> </w:t>
+      </w:r>
+      <w:r>
+        <w:rPr>
+          <w:i/>
+          <w:iCs/>
+        </w:rPr>
+        <w:t xml:space="preserve">vo2_estimate_ml_per_kg_min</w:t>
+      </w:r>
+      <w:r>
+        <w:t xml:space="preserve"> </w:t>
+      </w:r>
+      <w:r>
+        <w:t xml:space="preserve">— la p-value (0.094) est supérieure à 0.05. L’hypothèse de normalité ne peut pas être rejetée pour cette variable, ce qui est cohérent avec sa distribution quasi-gaussienne observée graphiquement.*</w:t>
+      </w:r>
+      <w:r>
+        <w:t xml:space="preserve"> </w:t>
+      </w:r>
+      <w:r>
+        <w:t xml:space="preserve">Conclusion générale : Seul le VO₂ max satisfait strictement l’hypothèse de normalité. Les trois autres variables présentent des distributions significativement non normales. Ce résultat ne remet pas en cause l’utilisation de l’ACP, qui est une méthode robuste ne supposant pas la normalité stricte des données.</w:t>
       </w:r>
     </w:p>
     <w:p>
@@ -5143,18 +5181,18 @@
           <wp:inline>
             <wp:extent cx="5334000" cy="3333750"/>
             <wp:effectExtent b="0" l="0" r="0" t="0"/>
-            <wp:docPr descr="" title="" id="37" name="Picture"/>
+            <wp:docPr descr="" title="" id="38" name="Picture"/>
             <a:graphic>
               <a:graphicData uri="http://schemas.openxmlformats.org/drawingml/2006/picture">
                 <pic:pic>
                   <pic:nvPicPr>
-                    <pic:cNvPr descr="rapport_ameliore_files/rapport_ameliore_files/figure-docx/unnamed-chunk-1-1.png" id="38" name="Picture"/>
+                    <pic:cNvPr descr="rapport_ameliore_files/rapport_ameliore_files/figure-docx/unnamed-chunk-1-1.png" id="39" name="Picture"/>
                     <pic:cNvPicPr>
                       <a:picLocks noChangeArrowheads="1" noChangeAspect="1"/>
                     </pic:cNvPicPr>
                   </pic:nvPicPr>
                   <pic:blipFill>
-                    <a:blip r:embed="rId36"/>
+                    <a:blip r:embed="rId37"/>
                     <a:stretch>
                       <a:fillRect/>
                     </a:stretch>
@@ -5354,18 +5392,18 @@
           <wp:inline>
             <wp:extent cx="5334000" cy="3333750"/>
             <wp:effectExtent b="0" l="0" r="0" t="0"/>
-            <wp:docPr descr="" title="" id="40" name="Picture"/>
+            <wp:docPr descr="" title="" id="41" name="Picture"/>
             <a:graphic>
               <a:graphicData uri="http://schemas.openxmlformats.org/drawingml/2006/picture">
                 <pic:pic>
                   <pic:nvPicPr>
-                    <pic:cNvPr descr="rapport_ameliore_files/rapport_ameliore_files/figure-docx/unnamed-chunk-2-1.png" id="41" name="Picture"/>
+                    <pic:cNvPr descr="rapport_ameliore_files/rapport_ameliore_files/figure-docx/unnamed-chunk-2-1.png" id="42" name="Picture"/>
                     <pic:cNvPicPr>
                       <a:picLocks noChangeArrowheads="1" noChangeAspect="1"/>
                     </pic:cNvPicPr>
                   </pic:nvPicPr>
                   <pic:blipFill>
-                    <a:blip r:embed="rId39"/>
+                    <a:blip r:embed="rId40"/>
                     <a:stretch>
                       <a:fillRect/>
                     </a:stretch>
@@ -5432,8 +5470,8 @@
         <w:t xml:space="preserve">Ce résultat explique directement l’épaulement bimodal observé dans l’histogramme de distribution globale de hand_grip_strength_kg : il résulte de la superposition des deux distributions (F et M) dans un graphique unique.</w:t>
       </w:r>
     </w:p>
-    <w:bookmarkEnd w:id="42"/>
-    <w:bookmarkStart w:id="46" w:name="standardisation-des-données"/>
+    <w:bookmarkEnd w:id="43"/>
+    <w:bookmarkStart w:id="47" w:name="standardisation-des-données"/>
     <w:p>
       <w:pPr>
         <w:pStyle w:val="Heading1"/>
@@ -5698,14 +5736,6 @@
           <w:rStyle w:val="NormalTok"/>
         </w:rPr>
         <w:t xml:space="preserve">(data_acp)</w:t>
-      </w:r>
-    </w:p>
-    <w:p>
-      <w:pPr>
-        <w:pStyle w:val="FirstParagraph"/>
-      </w:pPr>
-      <w:r>
-        <w:t xml:space="preserve">masculines en raison de leur surreprésentation.</w:t>
       </w:r>
     </w:p>
     <w:p>
@@ -5929,18 +5959,18 @@
           <wp:inline>
             <wp:extent cx="5334000" cy="3333750"/>
             <wp:effectExtent b="0" l="0" r="0" t="0"/>
-            <wp:docPr descr="" title="" id="44" name="Picture"/>
+            <wp:docPr descr="" title="" id="45" name="Picture"/>
             <a:graphic>
               <a:graphicData uri="http://schemas.openxmlformats.org/drawingml/2006/picture">
                 <pic:pic>
                   <pic:nvPicPr>
-                    <pic:cNvPr descr="rapport_ameliore_files/rapport_ameliore_files/figure-docx/unnamed-chunk-3-1.png" id="45" name="Picture"/>
+                    <pic:cNvPr descr="rapport_ameliore_files/rapport_ameliore_files/figure-docx/unnamed-chunk-3-1.png" id="46" name="Picture"/>
                     <pic:cNvPicPr>
                       <a:picLocks noChangeArrowheads="1" noChangeAspect="1"/>
                     </pic:cNvPicPr>
                   </pic:nvPicPr>
                   <pic:blipFill>
-                    <a:blip r:embed="rId43"/>
+                    <a:blip r:embed="rId44"/>
                     <a:stretch>
                       <a:fillRect/>
                     </a:stretch>
@@ -5997,8 +6027,8 @@
         <w:t xml:space="preserve"># Analyse en Composantes Principales (ACP)</w:t>
       </w:r>
     </w:p>
-    <w:bookmarkEnd w:id="46"/>
-    <w:bookmarkStart w:id="47" w:name="objectif-de-lacp"/>
+    <w:bookmarkEnd w:id="47"/>
+    <w:bookmarkStart w:id="48" w:name="objectif-de-lacp"/>
     <w:p>
       <w:pPr>
         <w:pStyle w:val="Heading1"/>
@@ -6071,8 +6101,8 @@
         <w:t xml:space="preserve">de faciliter l’interprétation globale des données.</w:t>
       </w:r>
     </w:p>
-    <w:bookmarkEnd w:id="47"/>
-    <w:bookmarkStart w:id="50" w:name="vérification-de-ladéquation-de-lacp"/>
+    <w:bookmarkEnd w:id="48"/>
+    <w:bookmarkStart w:id="51" w:name="vérification-de-ladéquation-de-lacp"/>
     <w:p>
       <w:pPr>
         <w:pStyle w:val="Heading1"/>
@@ -6081,7 +6111,7 @@
         <w:t xml:space="preserve">Vérification de l’adéquation de l’ACP</w:t>
       </w:r>
     </w:p>
-    <w:bookmarkStart w:id="48" w:name="test-kmo"/>
+    <w:bookmarkStart w:id="49" w:name="test-kmo"/>
     <w:p>
       <w:pPr>
         <w:pStyle w:val="Heading2"/>
@@ -6251,11 +6281,11 @@
         <w:pStyle w:val="BodyText"/>
       </w:pPr>
       <w:r>
-        <w:t xml:space="preserve">“Les variables sit_ups_count (MSA = 0.79) et sit_and_reach_cm (MSA = 0.76) présentent les meilleures adéquations factorielles individuelles, indiquant qu’elles partagent davantage de variance commune avec les autres variables. La variable percent_body_fat affiche le MSA le plus faible (0.61), bien qu’encore acceptable pour une ACP exploratoire.”</w:t>
-      </w:r>
-    </w:p>
-    <w:bookmarkEnd w:id="48"/>
-    <w:bookmarkStart w:id="49" w:name="test-de-bartlett"/>
+        <w:t xml:space="preserve">Les variables sit_ups_count (MSA = 0.79) et sit_and_reach_cm (MSA = 0.76) présentent les meilleures adéquations factorielles individuelles, indiquant qu’elles partagent davantage de variance commune avec les autres variables. La variable percent_body_fat affiche le MSA le plus faible (0.61), bien qu’encore acceptable pour une ACP exploratoire.”</w:t>
+      </w:r>
+    </w:p>
+    <w:bookmarkEnd w:id="49"/>
+    <w:bookmarkStart w:id="50" w:name="test-de-bartlett"/>
     <w:p>
       <w:pPr>
         <w:pStyle w:val="Heading2"/>
@@ -6407,9 +6437,9 @@
         <w:t xml:space="preserve">L’hypothèse d’indépendance des variables est donc rejetée, confirmant la pertinence statistique de l’ACP.</w:t>
       </w:r>
     </w:p>
-    <w:bookmarkEnd w:id="49"/>
     <w:bookmarkEnd w:id="50"/>
-    <w:bookmarkStart w:id="54" w:name="matrice-de-corrélation"/>
+    <w:bookmarkEnd w:id="51"/>
+    <w:bookmarkStart w:id="55" w:name="matrice-de-corrélation"/>
     <w:p>
       <w:pPr>
         <w:pStyle w:val="Heading1"/>
@@ -6657,18 +6687,18 @@
           <wp:inline>
             <wp:extent cx="5334000" cy="3333750"/>
             <wp:effectExtent b="0" l="0" r="0" t="0"/>
-            <wp:docPr descr="" title="" id="52" name="Picture"/>
+            <wp:docPr descr="" title="" id="53" name="Picture"/>
             <a:graphic>
               <a:graphicData uri="http://schemas.openxmlformats.org/drawingml/2006/picture">
                 <pic:pic>
                   <pic:nvPicPr>
-                    <pic:cNvPr descr="rapport_ameliore_files/rapport_ameliore_files/figure-docx/corrplot-1.png" id="53" name="Picture"/>
+                    <pic:cNvPr descr="rapport_ameliore_files/rapport_ameliore_files/figure-docx/corrplot-1.png" id="54" name="Picture"/>
                     <pic:cNvPicPr>
                       <a:picLocks noChangeArrowheads="1" noChangeAspect="1"/>
                     </pic:cNvPicPr>
                   </pic:nvPicPr>
                   <pic:blipFill>
-                    <a:blip r:embed="rId51"/>
+                    <a:blip r:embed="rId52"/>
                     <a:stretch>
                       <a:fillRect/>
                     </a:stretch>
@@ -6727,8 +6757,8 @@
         <w:t xml:space="preserve">La variable de flexibilité apparaît relativement indépendante des autres variables.</w:t>
       </w:r>
     </w:p>
-    <w:bookmarkEnd w:id="54"/>
-    <w:bookmarkStart w:id="55" w:name="réalisation-de-lacp"/>
+    <w:bookmarkEnd w:id="55"/>
+    <w:bookmarkStart w:id="56" w:name="réalisation-de-lacp"/>
     <w:p>
       <w:pPr>
         <w:pStyle w:val="Heading1"/>
@@ -6820,8 +6850,8 @@
         <w:t xml:space="preserve">)</w:t>
       </w:r>
     </w:p>
-    <w:bookmarkEnd w:id="55"/>
-    <w:bookmarkStart w:id="61" w:name="choix-du-nombre-de-composantes"/>
+    <w:bookmarkEnd w:id="56"/>
+    <w:bookmarkStart w:id="62" w:name="choix-du-nombre-de-composantes"/>
     <w:p>
       <w:pPr>
         <w:pStyle w:val="Heading1"/>
@@ -6830,7 +6860,7 @@
         <w:t xml:space="preserve">Choix du Nombre de Composantes</w:t>
       </w:r>
     </w:p>
-    <w:bookmarkStart w:id="56" w:name="valeurs-propres"/>
+    <w:bookmarkStart w:id="57" w:name="valeurs-propres"/>
     <w:p>
       <w:pPr>
         <w:pStyle w:val="Heading2"/>
@@ -6918,8 +6948,8 @@
         <w:t xml:space="preserve">## comp 5  0.4472493               8.944987                         100.00000</w:t>
       </w:r>
     </w:p>
-    <w:bookmarkEnd w:id="56"/>
-    <w:bookmarkStart w:id="60" w:name="scree-plot"/>
+    <w:bookmarkEnd w:id="57"/>
+    <w:bookmarkStart w:id="61" w:name="scree-plot"/>
     <w:p>
       <w:pPr>
         <w:pStyle w:val="Heading2"/>
@@ -6978,18 +7008,18 @@
           <wp:inline>
             <wp:extent cx="5334000" cy="3333750"/>
             <wp:effectExtent b="0" l="0" r="0" t="0"/>
-            <wp:docPr descr="" title="" id="58" name="Picture"/>
+            <wp:docPr descr="" title="" id="59" name="Picture"/>
             <a:graphic>
               <a:graphicData uri="http://schemas.openxmlformats.org/drawingml/2006/picture">
                 <pic:pic>
                   <pic:nvPicPr>
-                    <pic:cNvPr descr="rapport_ameliore_files/rapport_ameliore_files/figure-docx/screeplot-1.png" id="59" name="Picture"/>
+                    <pic:cNvPr descr="rapport_ameliore_files/rapport_ameliore_files/figure-docx/screeplot-1.png" id="60" name="Picture"/>
                     <pic:cNvPicPr>
                       <a:picLocks noChangeArrowheads="1" noChangeAspect="1"/>
                     </pic:cNvPicPr>
                   </pic:nvPicPr>
                   <pic:blipFill>
-                    <a:blip r:embed="rId57"/>
+                    <a:blip r:embed="rId58"/>
                     <a:stretch>
                       <a:fillRect/>
                     </a:stretch>
@@ -7034,9 +7064,9 @@
         <w:t xml:space="preserve">L’absence de coude franc dans l’éboulis est typique des données biométriques où les variables mesurent des dimensions physiologiques partiellement liées. Dans une perspective exploratoire, deux dimensions sont retenues, expliquant conjointement 58.83% de la variance totale. Ce taux, bien qu’inférieur à 70%, est jugé satisfaisant compte tenu du faible nombre de variables (5) et de la nature multidimensionnelle de la condition physique.</w:t>
       </w:r>
     </w:p>
-    <w:bookmarkEnd w:id="60"/>
     <w:bookmarkEnd w:id="61"/>
-    <w:bookmarkStart w:id="65" w:name="cercle-des-corrélations"/>
+    <w:bookmarkEnd w:id="62"/>
+    <w:bookmarkStart w:id="66" w:name="cercle-des-corrélations"/>
     <w:p>
       <w:pPr>
         <w:pStyle w:val="Heading1"/>
@@ -7206,18 +7236,18 @@
           <wp:inline>
             <wp:extent cx="5334000" cy="3333750"/>
             <wp:effectExtent b="0" l="0" r="0" t="0"/>
-            <wp:docPr descr="" title="" id="63" name="Picture"/>
+            <wp:docPr descr="" title="" id="64" name="Picture"/>
             <a:graphic>
               <a:graphicData uri="http://schemas.openxmlformats.org/drawingml/2006/picture">
                 <pic:pic>
                   <pic:nvPicPr>
-                    <pic:cNvPr descr="rapport_ameliore_files/rapport_ameliore_files/figure-docx/cercle-correlation-1.png" id="64" name="Picture"/>
+                    <pic:cNvPr descr="rapport_ameliore_files/rapport_ameliore_files/figure-docx/cercle-correlation-1.png" id="65" name="Picture"/>
                     <pic:cNvPicPr>
                       <a:picLocks noChangeArrowheads="1" noChangeAspect="1"/>
                     </pic:cNvPicPr>
                   </pic:nvPicPr>
                   <pic:blipFill>
-                    <a:blip r:embed="rId62"/>
+                    <a:blip r:embed="rId63"/>
                     <a:stretch>
                       <a:fillRect/>
                     </a:stretch>
@@ -7276,8 +7306,8 @@
         <w:t xml:space="preserve">Les couleurs confirment que percent_body_fat et hand_grip_strength_kg sont les variables les plus contributives (orange/rouge) à la construction des axes principaux.</w:t>
       </w:r>
     </w:p>
-    <w:bookmarkEnd w:id="65"/>
-    <w:bookmarkStart w:id="72" w:name="contributions-des-variables"/>
+    <w:bookmarkEnd w:id="66"/>
+    <w:bookmarkStart w:id="73" w:name="contributions-des-variables"/>
     <w:p>
       <w:pPr>
         <w:pStyle w:val="Heading1"/>
@@ -7360,18 +7390,18 @@
           <wp:inline>
             <wp:extent cx="5334000" cy="3333750"/>
             <wp:effectExtent b="0" l="0" r="0" t="0"/>
-            <wp:docPr descr="" title="" id="67" name="Picture"/>
+            <wp:docPr descr="" title="" id="68" name="Picture"/>
             <a:graphic>
               <a:graphicData uri="http://schemas.openxmlformats.org/drawingml/2006/picture">
                 <pic:pic>
                   <pic:nvPicPr>
-                    <pic:cNvPr descr="rapport_ameliore_files/rapport_ameliore_files/figure-docx/contributions-1.png" id="68" name="Picture"/>
+                    <pic:cNvPr descr="rapport_ameliore_files/rapport_ameliore_files/figure-docx/contributions-1.png" id="69" name="Picture"/>
                     <pic:cNvPicPr>
                       <a:picLocks noChangeArrowheads="1" noChangeAspect="1"/>
                     </pic:cNvPicPr>
                   </pic:nvPicPr>
                   <pic:blipFill>
-                    <a:blip r:embed="rId66"/>
+                    <a:blip r:embed="rId67"/>
                     <a:stretch>
                       <a:fillRect/>
                     </a:stretch>
@@ -7472,18 +7502,18 @@
           <wp:inline>
             <wp:extent cx="5334000" cy="3333750"/>
             <wp:effectExtent b="0" l="0" r="0" t="0"/>
-            <wp:docPr descr="" title="" id="70" name="Picture"/>
+            <wp:docPr descr="" title="" id="71" name="Picture"/>
             <a:graphic>
               <a:graphicData uri="http://schemas.openxmlformats.org/drawingml/2006/picture">
                 <pic:pic>
                   <pic:nvPicPr>
-                    <pic:cNvPr descr="rapport_ameliore_files/rapport_ameliore_files/figure-docx/contributions-2.png" id="71" name="Picture"/>
+                    <pic:cNvPr descr="rapport_ameliore_files/rapport_ameliore_files/figure-docx/contributions-2.png" id="72" name="Picture"/>
                     <pic:cNvPicPr>
                       <a:picLocks noChangeArrowheads="1" noChangeAspect="1"/>
                     </pic:cNvPicPr>
                   </pic:nvPicPr>
                   <pic:blipFill>
-                    <a:blip r:embed="rId69"/>
+                    <a:blip r:embed="rId70"/>
                     <a:stretch>
                       <a:fillRect/>
                     </a:stretch>
@@ -7542,8 +7572,8 @@
         <w:t xml:space="preserve">“sit_and_reach_cm domine massivement la deuxième composante avec une contribution d’environ 68%, très largement au-dessus du seuil de 20%. vo2_estimate_ml_per_kg_min (≈15%) et sit_ups_count (≈10%) contribuent secondairement. percent_body_fat et hand_grip_strength_kg sont quasi-absents de cette dimension (&lt; 5%), confirmant l’indépendance totale de la flexibilité par rapport aux autres capacités physiques.”</w:t>
       </w:r>
     </w:p>
-    <w:bookmarkEnd w:id="72"/>
-    <w:bookmarkStart w:id="76" w:name="qualité-de-représentation-des-variables"/>
+    <w:bookmarkEnd w:id="73"/>
+    <w:bookmarkStart w:id="77" w:name="qualité-de-représentation-des-variables"/>
     <w:p>
       <w:pPr>
         <w:pStyle w:val="Heading1"/>
@@ -7638,18 +7668,18 @@
           <wp:inline>
             <wp:extent cx="5334000" cy="3333750"/>
             <wp:effectExtent b="0" l="0" r="0" t="0"/>
-            <wp:docPr descr="" title="" id="74" name="Picture"/>
+            <wp:docPr descr="" title="" id="75" name="Picture"/>
             <a:graphic>
               <a:graphicData uri="http://schemas.openxmlformats.org/drawingml/2006/picture">
                 <pic:pic>
                   <pic:nvPicPr>
-                    <pic:cNvPr descr="rapport_ameliore_files/rapport_ameliore_files/figure-docx/cos2-1.png" id="75" name="Picture"/>
+                    <pic:cNvPr descr="rapport_ameliore_files/rapport_ameliore_files/figure-docx/cos2-1.png" id="76" name="Picture"/>
                     <pic:cNvPicPr>
                       <a:picLocks noChangeArrowheads="1" noChangeAspect="1"/>
                     </pic:cNvPicPr>
                   </pic:nvPicPr>
                   <pic:blipFill>
-                    <a:blip r:embed="rId73"/>
+                    <a:blip r:embed="rId74"/>
                     <a:stretch>
                       <a:fillRect/>
                     </a:stretch>
@@ -7716,8 +7746,8 @@
         <w:t xml:space="preserve">sit_ups_count (cos² ≈ 0.30) : représentation faible — l’endurance abdominale n’est pas bien capturée par les deux premiers axes. Une partie de son information est portée par les dimensions 3 et 4, ce qui justifie l’exploration complémentaire de Dim3.</w:t>
       </w:r>
     </w:p>
-    <w:bookmarkEnd w:id="76"/>
-    <w:bookmarkStart w:id="80" w:name="projection-des-individus"/>
+    <w:bookmarkEnd w:id="77"/>
+    <w:bookmarkStart w:id="81" w:name="projection-des-individus"/>
     <w:p>
       <w:pPr>
         <w:pStyle w:val="Heading1"/>
@@ -7863,18 +7893,18 @@
           <wp:inline>
             <wp:extent cx="5334000" cy="3333750"/>
             <wp:effectExtent b="0" l="0" r="0" t="0"/>
-            <wp:docPr descr="" title="" id="78" name="Picture"/>
+            <wp:docPr descr="" title="" id="79" name="Picture"/>
             <a:graphic>
               <a:graphicData uri="http://schemas.openxmlformats.org/drawingml/2006/picture">
                 <pic:pic>
                   <pic:nvPicPr>
-                    <pic:cNvPr descr="rapport_ameliore_files/rapport_ameliore_files/figure-docx/unnamed-chunk-4-1.png" id="79" name="Picture"/>
+                    <pic:cNvPr descr="rapport_ameliore_files/rapport_ameliore_files/figure-docx/unnamed-chunk-4-1.png" id="80" name="Picture"/>
                     <pic:cNvPicPr>
                       <a:picLocks noChangeArrowheads="1" noChangeAspect="1"/>
                     </pic:cNvPicPr>
                   </pic:nvPicPr>
                   <pic:blipFill>
-                    <a:blip r:embed="rId77"/>
+                    <a:blip r:embed="rId78"/>
                     <a:stretch>
                       <a:fillRect/>
                     </a:stretch>
@@ -7949,8 +7979,8 @@
         <w:t xml:space="preserve">L’absence de clusters visuellement distincts dans ce nuage de points motive le recours à une méthode de classification non supervisée (K-means ou CAH) pour identifier des groupes homogènes que l’œil ne peut pas détecter directement.</w:t>
       </w:r>
     </w:p>
-    <w:bookmarkEnd w:id="80"/>
-    <w:bookmarkStart w:id="84" w:name="un-biplot-individus-variables-ensemble"/>
+    <w:bookmarkEnd w:id="81"/>
+    <w:bookmarkStart w:id="85" w:name="un-biplot-individus-variables-ensemble"/>
     <w:p>
       <w:pPr>
         <w:pStyle w:val="Heading1"/>
@@ -8195,18 +8225,18 @@
           <wp:inline>
             <wp:extent cx="5334000" cy="3333750"/>
             <wp:effectExtent b="0" l="0" r="0" t="0"/>
-            <wp:docPr descr="" title="" id="82" name="Picture"/>
+            <wp:docPr descr="" title="" id="83" name="Picture"/>
             <a:graphic>
               <a:graphicData uri="http://schemas.openxmlformats.org/drawingml/2006/picture">
                 <pic:pic>
                   <pic:nvPicPr>
-                    <pic:cNvPr descr="rapport_ameliore_files/rapport_ameliore_files/figure-docx/unnamed-chunk-5-1.png" id="83" name="Picture"/>
+                    <pic:cNvPr descr="rapport_ameliore_files/rapport_ameliore_files/figure-docx/unnamed-chunk-5-1.png" id="84" name="Picture"/>
                     <pic:cNvPicPr>
                       <a:picLocks noChangeArrowheads="1" noChangeAspect="1"/>
                     </pic:cNvPicPr>
                   </pic:nvPicPr>
                   <pic:blipFill>
-                    <a:blip r:embed="rId81"/>
+                    <a:blip r:embed="rId82"/>
                     <a:stretch>
                       <a:fillRect/>
                     </a:stretch>
@@ -8251,8 +8281,8 @@
         <w:t xml:space="preserve"># Classification des Individus — K-Means</w:t>
       </w:r>
     </w:p>
-    <w:bookmarkEnd w:id="84"/>
-    <w:bookmarkStart w:id="85" w:name="objectif-du-clustering"/>
+    <w:bookmarkEnd w:id="85"/>
+    <w:bookmarkStart w:id="86" w:name="objectif-du-clustering"/>
     <w:p>
       <w:pPr>
         <w:pStyle w:val="Heading1"/>
@@ -8324,8 +8354,8 @@
         <w:t xml:space="preserve">coord</w:t>
       </w:r>
     </w:p>
-    <w:bookmarkEnd w:id="85"/>
-    <w:bookmarkStart w:id="95" w:name="choix-du-nombre-de-clusters"/>
+    <w:bookmarkEnd w:id="86"/>
+    <w:bookmarkStart w:id="96" w:name="choix-du-nombre-de-clusters"/>
     <w:p>
       <w:pPr>
         <w:pStyle w:val="Heading1"/>
@@ -8334,7 +8364,7 @@
         <w:t xml:space="preserve">Choix du Nombre de Clusters</w:t>
       </w:r>
     </w:p>
-    <w:bookmarkStart w:id="89" w:name="méthode-du-coude"/>
+    <w:bookmarkStart w:id="90" w:name="méthode-du-coude"/>
     <w:p>
       <w:pPr>
         <w:pStyle w:val="Heading2"/>
@@ -8393,18 +8423,18 @@
           <wp:inline>
             <wp:extent cx="5334000" cy="3333750"/>
             <wp:effectExtent b="0" l="0" r="0" t="0"/>
-            <wp:docPr descr="" title="" id="87" name="Picture"/>
+            <wp:docPr descr="" title="" id="88" name="Picture"/>
             <a:graphic>
               <a:graphicData uri="http://schemas.openxmlformats.org/drawingml/2006/picture">
                 <pic:pic>
                   <pic:nvPicPr>
-                    <pic:cNvPr descr="rapport_ameliore_files/rapport_ameliore_files/figure-docx/elbow-1.png" id="88" name="Picture"/>
+                    <pic:cNvPr descr="rapport_ameliore_files/rapport_ameliore_files/figure-docx/elbow-1.png" id="89" name="Picture"/>
                     <pic:cNvPicPr>
                       <a:picLocks noChangeArrowheads="1" noChangeAspect="1"/>
                     </pic:cNvPicPr>
                   </pic:nvPicPr>
                   <pic:blipFill>
-                    <a:blip r:embed="rId86"/>
+                    <a:blip r:embed="rId87"/>
                     <a:stretch>
                       <a:fillRect/>
                     </a:stretch>
@@ -8437,8 +8467,8 @@
         <w:t xml:space="preserve">La courbe de l’inertie intra-cluster (Within Sum of Squares) décroît rapidement de k=1 à k=3, puis s’aplatit progressivement. Une inflexion notable est observable entre k=2 et k=3 : le gain en compacité devient marginal au-delà de 3 clusters. Cette méthode suggère donc k=3 comme point d’équilibre entre compacité des groupes et simplicité du modèle.</w:t>
       </w:r>
     </w:p>
-    <w:bookmarkEnd w:id="89"/>
-    <w:bookmarkStart w:id="93" w:name="méthode-de-la-silhouette"/>
+    <w:bookmarkEnd w:id="90"/>
+    <w:bookmarkStart w:id="94" w:name="méthode-de-la-silhouette"/>
     <w:p>
       <w:pPr>
         <w:pStyle w:val="Heading2"/>
@@ -8497,18 +8527,18 @@
           <wp:inline>
             <wp:extent cx="5334000" cy="3333750"/>
             <wp:effectExtent b="0" l="0" r="0" t="0"/>
-            <wp:docPr descr="" title="" id="91" name="Picture"/>
+            <wp:docPr descr="" title="" id="92" name="Picture"/>
             <a:graphic>
               <a:graphicData uri="http://schemas.openxmlformats.org/drawingml/2006/picture">
                 <pic:pic>
                   <pic:nvPicPr>
-                    <pic:cNvPr descr="rapport_ameliore_files/rapport_ameliore_files/figure-docx/silhouette-1.png" id="92" name="Picture"/>
+                    <pic:cNvPr descr="rapport_ameliore_files/rapport_ameliore_files/figure-docx/silhouette-1.png" id="93" name="Picture"/>
                     <pic:cNvPicPr>
                       <a:picLocks noChangeArrowheads="1" noChangeAspect="1"/>
                     </pic:cNvPicPr>
                   </pic:nvPicPr>
                   <pic:blipFill>
-                    <a:blip r:embed="rId90"/>
+                    <a:blip r:embed="rId91"/>
                     <a:stretch>
                       <a:fillRect/>
                     </a:stretch>
@@ -8541,8 +8571,8 @@
         <w:t xml:space="preserve">La silhouette moyenne atteint son maximum à k=2 (≈ 0.31), indiquant que deux clusters constituent la partition la plus compacte et la mieux séparée statistiquement. Cependant, cette valeur de 0.31 reste modérée, reflétant le chevauchement naturel des profils physiologiques dans cet échantillon. À partir de k=3, la silhouette chute à ≈ 0.20 puis se stabilise autour de 0.16–0.17 pour k ≥ 5, sans amélioration significative. Cette stabilisation confirme que k=3 est acceptable malgré un léger sacrifice de cohésion intra-cluster, justifié par le gain interprétatif.</w:t>
       </w:r>
     </w:p>
-    <w:bookmarkEnd w:id="93"/>
-    <w:bookmarkStart w:id="94" w:name="choix-du-nombre-de-k"/>
+    <w:bookmarkEnd w:id="94"/>
+    <w:bookmarkStart w:id="95" w:name="choix-du-nombre-de-k"/>
     <w:p>
       <w:pPr>
         <w:pStyle w:val="Heading2"/>
@@ -8559,9 +8589,9 @@
         <w:t xml:space="preserve">La méthode de la silhouette suggère k=2 (largeur moyenne = 0.31), mais ce nombre de clusters produit une segmentation trop grossière pour être interprétable dans un contexte biométrique. La méthode du coude montre une inflexion notable entre k=2 et k=3, après quoi le gain en inertie devient marginal. Le choix de k=3 représente donc le meilleur compromis entre parcimonie statistique et richesse interprétable, permettant de distinguer trois profils physiologiques distincts et cohérents avec la littérature en sciences du sport.</w:t>
       </w:r>
     </w:p>
-    <w:bookmarkEnd w:id="94"/>
     <w:bookmarkEnd w:id="95"/>
-    <w:bookmarkStart w:id="96" w:name="application-du-k-means"/>
+    <w:bookmarkEnd w:id="96"/>
+    <w:bookmarkStart w:id="97" w:name="application-du-k-means"/>
     <w:p>
       <w:pPr>
         <w:pStyle w:val="Heading1"/>
@@ -8802,8 +8832,8 @@
         <w:t xml:space="preserve">## 699 606 695</w:t>
       </w:r>
     </w:p>
-    <w:bookmarkEnd w:id="96"/>
-    <w:bookmarkStart w:id="100" w:name="visualisation-des-clusters"/>
+    <w:bookmarkEnd w:id="97"/>
+    <w:bookmarkStart w:id="101" w:name="visualisation-des-clusters"/>
     <w:p>
       <w:pPr>
         <w:pStyle w:val="Heading1"/>
@@ -8937,18 +8967,18 @@
           <wp:inline>
             <wp:extent cx="5334000" cy="3333750"/>
             <wp:effectExtent b="0" l="0" r="0" t="0"/>
-            <wp:docPr descr="" title="" id="98" name="Picture"/>
+            <wp:docPr descr="" title="" id="99" name="Picture"/>
             <a:graphic>
               <a:graphicData uri="http://schemas.openxmlformats.org/drawingml/2006/picture">
                 <pic:pic>
                   <pic:nvPicPr>
-                    <pic:cNvPr descr="rapport_ameliore_files/rapport_ameliore_files/figure-docx/visualisation-clusters-1.png" id="99" name="Picture"/>
+                    <pic:cNvPr descr="rapport_ameliore_files/rapport_ameliore_files/figure-docx/visualisation-clusters-1.png" id="100" name="Picture"/>
                     <pic:cNvPicPr>
                       <a:picLocks noChangeArrowheads="1" noChangeAspect="1"/>
                     </pic:cNvPicPr>
                   </pic:nvPicPr>
                   <pic:blipFill>
-                    <a:blip r:embed="rId97"/>
+                    <a:blip r:embed="rId98"/>
                     <a:stretch>
                       <a:fillRect/>
                     </a:stretch>
@@ -9397,8 +9427,8 @@
         <w:t xml:space="preserve">Les clusters 1 et 3 présentent des masses grasses similaires (≈ 43.8% vs 43.9%), mais se distinguent clairement par la flexibilité (2.98 vs 11.7 cm) et le VO₂ max (37.3 vs 39.6). Le cluster 2 se démarque nettement par une masse grasse très élevée (56.9%) et une force de préhension très faible (25.1 kg), avec paradoxalement le plus grand nombre d’abdominaux (19.3).</w:t>
       </w:r>
     </w:p>
-    <w:bookmarkEnd w:id="100"/>
-    <w:bookmarkStart w:id="113" w:name="distribution-des-variables-par-cluster"/>
+    <w:bookmarkEnd w:id="101"/>
+    <w:bookmarkStart w:id="115" w:name="distribution-des-variables-par-cluster"/>
     <w:p>
       <w:pPr>
         <w:pStyle w:val="Heading1"/>
@@ -9691,18 +9721,18 @@
           <wp:inline>
             <wp:extent cx="5334000" cy="3333750"/>
             <wp:effectExtent b="0" l="0" r="0" t="0"/>
-            <wp:docPr descr="" title="" id="102" name="Picture"/>
+            <wp:docPr descr="" title="" id="103" name="Picture"/>
             <a:graphic>
               <a:graphicData uri="http://schemas.openxmlformats.org/drawingml/2006/picture">
                 <pic:pic>
                   <pic:nvPicPr>
-                    <pic:cNvPr descr="rapport_ameliore_files/rapport_ameliore_files/figure-docx/unnamed-chunk-7-1.png" id="103" name="Picture"/>
+                    <pic:cNvPr descr="rapport_ameliore_files/rapport_ameliore_files/figure-docx/unnamed-chunk-7-1.png" id="104" name="Picture"/>
                     <pic:cNvPicPr>
                       <a:picLocks noChangeArrowheads="1" noChangeAspect="1"/>
                     </pic:cNvPicPr>
                   </pic:nvPicPr>
                   <pic:blipFill>
-                    <a:blip r:embed="rId101"/>
+                    <a:blip r:embed="rId102"/>
                     <a:stretch>
                       <a:fillRect/>
                     </a:stretch>
@@ -9760,23 +9790,7 @@
         <w:pStyle w:val="BodyText"/>
       </w:pPr>
       <w:r>
-        <w:t xml:space="preserve">Ces différences confirment que la flexibilité contribue à distinguer les clusters, bien qu’elle soit principalement portée par Dim2 dans l’ACP. Le chevauchement entre clusters 2 et 3 sur cette variable suggère que la flexibilité seule ne suffit pas à les discriminer — c’est la combinaison avec les variables de Dim1 qui permet la séparation.”</w:t>
-      </w:r>
-    </w:p>
-    <w:p>
-      <w:pPr>
-        <w:pStyle w:val="BodyText"/>
-      </w:pPr>
-      <w:r>
-        <w:t xml:space="preserve">Les boxplots montrent des différences visibles entre les clusters, notamment concernant le BMI et le VO₂ max.</w:t>
-      </w:r>
-    </w:p>
-    <w:p>
-      <w:pPr>
-        <w:pStyle w:val="BodyText"/>
-      </w:pPr>
-      <w:r>
-        <w:t xml:space="preserve">Ces résultats confirment la pertinence de la segmentation obtenue.</w:t>
+        <w:t xml:space="preserve">Ces différences confirment que la flexibilité contribue à distinguer les clusters, bien qu’elle soit principalement portée par Dim2 dans l’ACP. Le chevauchement entre clusters 2 et 3 sur cette variable suggère que la flexibilité seule ne suffit pas à les discriminer — c’est la combinaison avec les variables de Dim1 qui permet la séparation.</w:t>
       </w:r>
     </w:p>
     <w:p>
@@ -10063,18 +10077,18 @@
           <wp:inline>
             <wp:extent cx="5334000" cy="3333750"/>
             <wp:effectExtent b="0" l="0" r="0" t="0"/>
-            <wp:docPr descr="" title="" id="105" name="Picture"/>
+            <wp:docPr descr="" title="" id="106" name="Picture"/>
             <a:graphic>
               <a:graphicData uri="http://schemas.openxmlformats.org/drawingml/2006/picture">
                 <pic:pic>
                   <pic:nvPicPr>
-                    <pic:cNvPr descr="rapport_ameliore_files/rapport_ameliore_files/figure-docx/unnamed-chunk-8-1.png" id="106" name="Picture"/>
+                    <pic:cNvPr descr="rapport_ameliore_files/rapport_ameliore_files/figure-docx/unnamed-chunk-8-1.png" id="107" name="Picture"/>
                     <pic:cNvPicPr>
                       <a:picLocks noChangeArrowheads="1" noChangeAspect="1"/>
                     </pic:cNvPicPr>
                   </pic:nvPicPr>
                   <pic:blipFill>
-                    <a:blip r:embed="rId104"/>
+                    <a:blip r:embed="rId105"/>
                     <a:stretch>
                       <a:fillRect/>
                     </a:stretch>
@@ -10311,18 +10325,18 @@
           <wp:inline>
             <wp:extent cx="5334000" cy="3333750"/>
             <wp:effectExtent b="0" l="0" r="0" t="0"/>
-            <wp:docPr descr="" title="" id="108" name="Picture"/>
+            <wp:docPr descr="" title="" id="109" name="Picture"/>
             <a:graphic>
               <a:graphicData uri="http://schemas.openxmlformats.org/drawingml/2006/picture">
                 <pic:pic>
                   <pic:nvPicPr>
-                    <pic:cNvPr descr="rapport_ameliore_files/rapport_ameliore_files/figure-docx/unnamed-chunk-9-1.png" id="109" name="Picture"/>
+                    <pic:cNvPr descr="rapport_ameliore_files/rapport_ameliore_files/figure-docx/unnamed-chunk-9-1.png" id="110" name="Picture"/>
                     <pic:cNvPicPr>
                       <a:picLocks noChangeArrowheads="1" noChangeAspect="1"/>
                     </pic:cNvPicPr>
                   </pic:nvPicPr>
                   <pic:blipFill>
-                    <a:blip r:embed="rId107"/>
+                    <a:blip r:embed="rId108"/>
                     <a:stretch>
                       <a:fillRect/>
                     </a:stretch>
@@ -10565,18 +10579,18 @@
           <wp:inline>
             <wp:extent cx="5334000" cy="3333750"/>
             <wp:effectExtent b="0" l="0" r="0" t="0"/>
-            <wp:docPr descr="" title="" id="111" name="Picture"/>
+            <wp:docPr descr="" title="" id="112" name="Picture"/>
             <a:graphic>
               <a:graphicData uri="http://schemas.openxmlformats.org/drawingml/2006/picture">
                 <pic:pic>
                   <pic:nvPicPr>
-                    <pic:cNvPr descr="rapport_ameliore_files/rapport_ameliore_files/figure-docx/unnamed-chunk-10-1.png" id="112" name="Picture"/>
+                    <pic:cNvPr descr="rapport_ameliore_files/rapport_ameliore_files/figure-docx/unnamed-chunk-10-1.png" id="113" name="Picture"/>
                     <pic:cNvPicPr>
                       <a:picLocks noChangeArrowheads="1" noChangeAspect="1"/>
                     </pic:cNvPicPr>
                   </pic:nvPicPr>
                   <pic:blipFill>
-                    <a:blip r:embed="rId110"/>
+                    <a:blip r:embed="rId111"/>
                     <a:stretch>
                       <a:fillRect/>
                     </a:stretch>
@@ -10637,224 +10651,272 @@
         <w:t xml:space="preserve">La séparation nette du cluster 2 par rapport aux clusters 1 et 3 sur cette variable explique pourquoi hand_grip_strength_kg est la variable la plus contributive à Dim1 de l’ACP : elle discrimine efficacement les profils féminins des profils masculins.</w:t>
       </w:r>
     </w:p>
+    <w:bookmarkStart w:id="114" w:name="répartition-hommesfemmes-par-cluster"/>
+    <w:p>
+      <w:pPr>
+        <w:pStyle w:val="Heading2"/>
+      </w:pPr>
+      <w:r>
+        <w:t xml:space="preserve">Répartition hommes/femmes par cluster</w:t>
+      </w:r>
+    </w:p>
+    <w:p>
+      <w:pPr>
+        <w:pStyle w:val="SourceCode"/>
+      </w:pPr>
+      <w:r>
+        <w:rPr>
+          <w:rStyle w:val="FunctionTok"/>
+        </w:rPr>
+        <w:t xml:space="preserve">table</w:t>
+      </w:r>
+      <w:r>
+        <w:rPr>
+          <w:rStyle w:val="NormalTok"/>
+        </w:rPr>
+        <w:t xml:space="preserve">(health_clean</w:t>
+      </w:r>
+      <w:r>
+        <w:rPr>
+          <w:rStyle w:val="SpecialCharTok"/>
+        </w:rPr>
+        <w:t xml:space="preserve">$</w:t>
+      </w:r>
+      <w:r>
+        <w:rPr>
+          <w:rStyle w:val="NormalTok"/>
+        </w:rPr>
+        <w:t xml:space="preserve">cluster, health_clean</w:t>
+      </w:r>
+      <w:r>
+        <w:rPr>
+          <w:rStyle w:val="SpecialCharTok"/>
+        </w:rPr>
+        <w:t xml:space="preserve">$</w:t>
+      </w:r>
+      <w:r>
+        <w:rPr>
+          <w:rStyle w:val="NormalTok"/>
+        </w:rPr>
+        <w:t xml:space="preserve">sex)</w:t>
+      </w:r>
+    </w:p>
+    <w:p>
+      <w:pPr>
+        <w:pStyle w:val="SourceCode"/>
+      </w:pPr>
+      <w:r>
+        <w:rPr>
+          <w:rStyle w:val="VerbatimChar"/>
+        </w:rPr>
+        <w:t xml:space="preserve">##    </w:t>
+      </w:r>
+      <w:r>
+        <w:br/>
+      </w:r>
+      <w:r>
+        <w:rPr>
+          <w:rStyle w:val="VerbatimChar"/>
+        </w:rPr>
+        <w:t xml:space="preserve">##       F   M</w:t>
+      </w:r>
+      <w:r>
+        <w:br/>
+      </w:r>
+      <w:r>
+        <w:rPr>
+          <w:rStyle w:val="VerbatimChar"/>
+        </w:rPr>
+        <w:t xml:space="preserve">##   1  11 688</w:t>
+      </w:r>
+      <w:r>
+        <w:br/>
+      </w:r>
+      <w:r>
+        <w:rPr>
+          <w:rStyle w:val="VerbatimChar"/>
+        </w:rPr>
+        <w:t xml:space="preserve">##   2 594  12</w:t>
+      </w:r>
+      <w:r>
+        <w:br/>
+      </w:r>
+      <w:r>
+        <w:rPr>
+          <w:rStyle w:val="VerbatimChar"/>
+        </w:rPr>
+        <w:t xml:space="preserve">##   3  40 655</w:t>
+      </w:r>
+    </w:p>
+    <w:p>
+      <w:pPr>
+        <w:pStyle w:val="SourceCode"/>
+      </w:pPr>
+      <w:r>
+        <w:rPr>
+          <w:rStyle w:val="FunctionTok"/>
+        </w:rPr>
+        <w:t xml:space="preserve">prop.table</w:t>
+      </w:r>
+      <w:r>
+        <w:rPr>
+          <w:rStyle w:val="NormalTok"/>
+        </w:rPr>
+        <w:t xml:space="preserve">(</w:t>
+      </w:r>
+      <w:r>
+        <w:rPr>
+          <w:rStyle w:val="FunctionTok"/>
+        </w:rPr>
+        <w:t xml:space="preserve">table</w:t>
+      </w:r>
+      <w:r>
+        <w:rPr>
+          <w:rStyle w:val="NormalTok"/>
+        </w:rPr>
+        <w:t xml:space="preserve">(health_clean</w:t>
+      </w:r>
+      <w:r>
+        <w:rPr>
+          <w:rStyle w:val="SpecialCharTok"/>
+        </w:rPr>
+        <w:t xml:space="preserve">$</w:t>
+      </w:r>
+      <w:r>
+        <w:rPr>
+          <w:rStyle w:val="NormalTok"/>
+        </w:rPr>
+        <w:t xml:space="preserve">cluster, health_clean</w:t>
+      </w:r>
+      <w:r>
+        <w:rPr>
+          <w:rStyle w:val="SpecialCharTok"/>
+        </w:rPr>
+        <w:t xml:space="preserve">$</w:t>
+      </w:r>
+      <w:r>
+        <w:rPr>
+          <w:rStyle w:val="NormalTok"/>
+        </w:rPr>
+        <w:t xml:space="preserve">sex), </w:t>
+      </w:r>
+      <w:r>
+        <w:rPr>
+          <w:rStyle w:val="AttributeTok"/>
+        </w:rPr>
+        <w:t xml:space="preserve">margin =</w:t>
+      </w:r>
+      <w:r>
+        <w:rPr>
+          <w:rStyle w:val="NormalTok"/>
+        </w:rPr>
+        <w:t xml:space="preserve"> </w:t>
+      </w:r>
+      <w:r>
+        <w:rPr>
+          <w:rStyle w:val="DecValTok"/>
+        </w:rPr>
+        <w:t xml:space="preserve">1</w:t>
+      </w:r>
+      <w:r>
+        <w:rPr>
+          <w:rStyle w:val="NormalTok"/>
+        </w:rPr>
+        <w:t xml:space="preserve">)</w:t>
+      </w:r>
+    </w:p>
+    <w:p>
+      <w:pPr>
+        <w:pStyle w:val="SourceCode"/>
+      </w:pPr>
+      <w:r>
+        <w:rPr>
+          <w:rStyle w:val="VerbatimChar"/>
+        </w:rPr>
+        <w:t xml:space="preserve">##    </w:t>
+      </w:r>
+      <w:r>
+        <w:br/>
+      </w:r>
+      <w:r>
+        <w:rPr>
+          <w:rStyle w:val="VerbatimChar"/>
+        </w:rPr>
+        <w:t xml:space="preserve">##              F          M</w:t>
+      </w:r>
+      <w:r>
+        <w:br/>
+      </w:r>
+      <w:r>
+        <w:rPr>
+          <w:rStyle w:val="VerbatimChar"/>
+        </w:rPr>
+        <w:t xml:space="preserve">##   1 0.01573677 0.98426323</w:t>
+      </w:r>
+      <w:r>
+        <w:br/>
+      </w:r>
+      <w:r>
+        <w:rPr>
+          <w:rStyle w:val="VerbatimChar"/>
+        </w:rPr>
+        <w:t xml:space="preserve">##   2 0.98019802 0.01980198</w:t>
+      </w:r>
+      <w:r>
+        <w:br/>
+      </w:r>
+      <w:r>
+        <w:rPr>
+          <w:rStyle w:val="VerbatimChar"/>
+        </w:rPr>
+        <w:t xml:space="preserve">##   3 0.05755396 0.94244604</w:t>
+      </w:r>
+    </w:p>
+    <w:p>
+      <w:pPr>
+        <w:pStyle w:val="FirstParagraph"/>
+      </w:pPr>
+      <w:r>
+        <w:t xml:space="preserve">La répartition par sexe révèle une segmentation quasi-totalement déterminée par le sexe :</w:t>
+      </w:r>
+    </w:p>
     <w:p>
       <w:pPr>
         <w:pStyle w:val="BodyText"/>
       </w:pPr>
       <w:r>
-        <w:t xml:space="preserve">##. Répartition hommes/femmes par cluster</w:t>
-      </w:r>
-    </w:p>
-    <w:p>
-      <w:pPr>
-        <w:pStyle w:val="SourceCode"/>
-      </w:pPr>
-      <w:r>
-        <w:rPr>
-          <w:rStyle w:val="FunctionTok"/>
-        </w:rPr>
-        <w:t xml:space="preserve">table</w:t>
-      </w:r>
-      <w:r>
-        <w:rPr>
-          <w:rStyle w:val="NormalTok"/>
-        </w:rPr>
-        <w:t xml:space="preserve">(health_clean</w:t>
-      </w:r>
-      <w:r>
-        <w:rPr>
-          <w:rStyle w:val="SpecialCharTok"/>
-        </w:rPr>
-        <w:t xml:space="preserve">$</w:t>
-      </w:r>
-      <w:r>
-        <w:rPr>
-          <w:rStyle w:val="NormalTok"/>
-        </w:rPr>
-        <w:t xml:space="preserve">cluster, health_clean</w:t>
-      </w:r>
-      <w:r>
-        <w:rPr>
-          <w:rStyle w:val="SpecialCharTok"/>
-        </w:rPr>
-        <w:t xml:space="preserve">$</w:t>
-      </w:r>
-      <w:r>
-        <w:rPr>
-          <w:rStyle w:val="NormalTok"/>
-        </w:rPr>
-        <w:t xml:space="preserve">sex)</w:t>
-      </w:r>
-    </w:p>
-    <w:p>
-      <w:pPr>
-        <w:pStyle w:val="SourceCode"/>
-      </w:pPr>
-      <w:r>
-        <w:rPr>
-          <w:rStyle w:val="VerbatimChar"/>
-        </w:rPr>
-        <w:t xml:space="preserve">##    </w:t>
-      </w:r>
-      <w:r>
-        <w:br/>
-      </w:r>
-      <w:r>
-        <w:rPr>
-          <w:rStyle w:val="VerbatimChar"/>
-        </w:rPr>
-        <w:t xml:space="preserve">##       F   M</w:t>
-      </w:r>
-      <w:r>
-        <w:br/>
-      </w:r>
-      <w:r>
-        <w:rPr>
-          <w:rStyle w:val="VerbatimChar"/>
-        </w:rPr>
-        <w:t xml:space="preserve">##   1  11 688</w:t>
-      </w:r>
-      <w:r>
-        <w:br/>
-      </w:r>
-      <w:r>
-        <w:rPr>
-          <w:rStyle w:val="VerbatimChar"/>
-        </w:rPr>
-        <w:t xml:space="preserve">##   2 594  12</w:t>
-      </w:r>
-      <w:r>
-        <w:br/>
-      </w:r>
-      <w:r>
-        <w:rPr>
-          <w:rStyle w:val="VerbatimChar"/>
-        </w:rPr>
-        <w:t xml:space="preserve">##   3  40 655</w:t>
-      </w:r>
-    </w:p>
-    <w:p>
-      <w:pPr>
-        <w:pStyle w:val="SourceCode"/>
-      </w:pPr>
-      <w:r>
-        <w:rPr>
-          <w:rStyle w:val="FunctionTok"/>
-        </w:rPr>
-        <w:t xml:space="preserve">prop.table</w:t>
-      </w:r>
-      <w:r>
-        <w:rPr>
-          <w:rStyle w:val="NormalTok"/>
-        </w:rPr>
-        <w:t xml:space="preserve">(</w:t>
-      </w:r>
-      <w:r>
-        <w:rPr>
-          <w:rStyle w:val="FunctionTok"/>
-        </w:rPr>
-        <w:t xml:space="preserve">table</w:t>
-      </w:r>
-      <w:r>
-        <w:rPr>
-          <w:rStyle w:val="NormalTok"/>
-        </w:rPr>
-        <w:t xml:space="preserve">(health_clean</w:t>
-      </w:r>
-      <w:r>
-        <w:rPr>
-          <w:rStyle w:val="SpecialCharTok"/>
-        </w:rPr>
-        <w:t xml:space="preserve">$</w:t>
-      </w:r>
-      <w:r>
-        <w:rPr>
-          <w:rStyle w:val="NormalTok"/>
-        </w:rPr>
-        <w:t xml:space="preserve">cluster, health_clean</w:t>
-      </w:r>
-      <w:r>
-        <w:rPr>
-          <w:rStyle w:val="SpecialCharTok"/>
-        </w:rPr>
-        <w:t xml:space="preserve">$</w:t>
-      </w:r>
-      <w:r>
-        <w:rPr>
-          <w:rStyle w:val="NormalTok"/>
-        </w:rPr>
-        <w:t xml:space="preserve">sex), </w:t>
-      </w:r>
-      <w:r>
-        <w:rPr>
-          <w:rStyle w:val="AttributeTok"/>
-        </w:rPr>
-        <w:t xml:space="preserve">margin =</w:t>
-      </w:r>
-      <w:r>
-        <w:rPr>
-          <w:rStyle w:val="NormalTok"/>
-        </w:rPr>
-        <w:t xml:space="preserve"> </w:t>
-      </w:r>
-      <w:r>
-        <w:rPr>
-          <w:rStyle w:val="DecValTok"/>
-        </w:rPr>
-        <w:t xml:space="preserve">1</w:t>
-      </w:r>
-      <w:r>
-        <w:rPr>
-          <w:rStyle w:val="NormalTok"/>
-        </w:rPr>
-        <w:t xml:space="preserve">)</w:t>
-      </w:r>
-    </w:p>
-    <w:p>
-      <w:pPr>
-        <w:pStyle w:val="SourceCode"/>
-      </w:pPr>
-      <w:r>
-        <w:rPr>
-          <w:rStyle w:val="VerbatimChar"/>
-        </w:rPr>
-        <w:t xml:space="preserve">##    </w:t>
-      </w:r>
-      <w:r>
-        <w:br/>
-      </w:r>
-      <w:r>
-        <w:rPr>
-          <w:rStyle w:val="VerbatimChar"/>
-        </w:rPr>
-        <w:t xml:space="preserve">##              F          M</w:t>
-      </w:r>
-      <w:r>
-        <w:br/>
-      </w:r>
-      <w:r>
-        <w:rPr>
-          <w:rStyle w:val="VerbatimChar"/>
-        </w:rPr>
-        <w:t xml:space="preserve">##   1 0.01573677 0.98426323</w:t>
-      </w:r>
-      <w:r>
-        <w:br/>
-      </w:r>
-      <w:r>
-        <w:rPr>
-          <w:rStyle w:val="VerbatimChar"/>
-        </w:rPr>
-        <w:t xml:space="preserve">##   2 0.98019802 0.01980198</w:t>
-      </w:r>
-      <w:r>
-        <w:br/>
-      </w:r>
-      <w:r>
-        <w:rPr>
-          <w:rStyle w:val="VerbatimChar"/>
-        </w:rPr>
-        <w:t xml:space="preserve">##   3 0.05755396 0.94244604</w:t>
+        <w:t xml:space="preserve">Cluster 1 : 98.6% d’hommes (688M / 11F) → groupe masculin musclé</w:t>
+      </w:r>
+      <w:r>
+        <w:t xml:space="preserve"> </w:t>
+      </w:r>
+      <w:r>
+        <w:t xml:space="preserve">Cluster 2 : 98.0% de femmes (594F / 12M) → groupe féminin</w:t>
+      </w:r>
+      <w:r>
+        <w:t xml:space="preserve"> </w:t>
+      </w:r>
+      <w:r>
+        <w:t xml:space="preserve">Cluster 3 : 94.2% d’hommes (655M / 40F) → groupe masculin flexible</w:t>
+      </w:r>
+    </w:p>
+    <w:p>
+      <w:pPr>
+        <w:pStyle w:val="BodyText"/>
+      </w:pPr>
+      <w:r>
+        <w:t xml:space="preserve">Ce résultat est fondamental : il signifie que le K-Means a essentiellement capturé les différences physiologiques entre sexes plutôt que des profils de condition physique transversaux. La variable sex n’étant pas incluse dans l’ACP, cette segmentation émerge naturellement des données, confirmant que le sexe est le principal facteur structurant des profils physiologiques dans cet échantillon.</w:t>
+      </w:r>
+    </w:p>
+    <w:bookmarkEnd w:id="114"/>
+    <w:bookmarkEnd w:id="115"/>
+    <w:bookmarkStart w:id="116" w:name="nommage-des-profils"/>
+    <w:p>
+      <w:pPr>
+        <w:pStyle w:val="Heading1"/>
+      </w:pPr>
+      <w:r>
+        <w:t xml:space="preserve">Nommage des profils</w:t>
       </w:r>
     </w:p>
     <w:p>
@@ -10862,7 +10924,13 @@
         <w:pStyle w:val="FirstParagraph"/>
       </w:pPr>
       <w:r>
-        <w:t xml:space="preserve">La répartition par sexe révèle une segmentation quasi-totalement déterminée par le sexe :</w:t>
+        <w:t xml:space="preserve">La segmentation obtenue reflète principalement les différences physiologiques naturelles liées au sexe, la variable sex n’ayant pas été incluse comme variable active dans l’ACP. Ce résultat, bien que biologiquement attendu, confirme la robustesse de l’algorithme K-Means qui a su détecter cette structure sous-jacente sans information explicite sur le genre. Une analyse complémentaire séparée par sexe pourrait permettre d’identifier des sous-profils plus fins au sein de chaque groupe</w:t>
+      </w:r>
+      <w:r>
+        <w:t xml:space="preserve"> </w:t>
+      </w:r>
+      <w:r>
+        <w:t xml:space="preserve">Sur la base des statistiques descriptives par cluster, trois profils physiologiques distincts ont été identifiés :</w:t>
       </w:r>
     </w:p>
     <w:p>
@@ -10870,58 +10938,6 @@
         <w:pStyle w:val="BodyText"/>
       </w:pPr>
       <w:r>
-        <w:t xml:space="preserve">Cluster 1 : 98.6% d’hommes (688M / 10F) → groupe masculin musclé</w:t>
-      </w:r>
-      <w:r>
-        <w:t xml:space="preserve"> </w:t>
-      </w:r>
-      <w:r>
-        <w:t xml:space="preserve">Cluster 2 : 98.0% de femmes (595F / 12M) → groupe féminin</w:t>
-      </w:r>
-      <w:r>
-        <w:t xml:space="preserve"> </w:t>
-      </w:r>
-      <w:r>
-        <w:t xml:space="preserve">Cluster 3 : 94.2% d’hommes (655M / 40F) → groupe masculin flexible</w:t>
-      </w:r>
-    </w:p>
-    <w:p>
-      <w:pPr>
-        <w:pStyle w:val="BodyText"/>
-      </w:pPr>
-      <w:r>
-        <w:t xml:space="preserve">Ce résultat est fondamental : il signifie que le K-Means a essentiellement capturé les différences physiologiques entre sexes plutôt que des profils de condition physique transversaux. La variable sex n’étant pas incluse dans l’ACP, cette segmentation émerge naturellement des données, confirmant que le sexe est le principal facteur structurant des profils physiologiques dans cet échantillon.</w:t>
-      </w:r>
-    </w:p>
-    <w:bookmarkEnd w:id="113"/>
-    <w:bookmarkStart w:id="114" w:name="nommage-des-profils"/>
-    <w:p>
-      <w:pPr>
-        <w:pStyle w:val="Heading1"/>
-      </w:pPr>
-      <w:r>
-        <w:t xml:space="preserve">Nommage des profils</w:t>
-      </w:r>
-    </w:p>
-    <w:p>
-      <w:pPr>
-        <w:pStyle w:val="FirstParagraph"/>
-      </w:pPr>
-      <w:r>
-        <w:t xml:space="preserve">La segmentation obtenue reflète principalement les différences physiologiques naturelles liées au sexe, la variable sex n’ayant pas été incluse comme variable active dans l’ACP. Ce résultat, bien que biologiquement attendu, confirme la robustesse de l’algorithme K-Means qui a su détecter cette structure sous-jacente sans information explicite sur le genre. Une analyse complémentaire séparée par sexe pourrait permettre d’identifier des sous-profils plus fins au sein de chaque groupe</w:t>
-      </w:r>
-      <w:r>
-        <w:t xml:space="preserve"> </w:t>
-      </w:r>
-      <w:r>
-        <w:t xml:space="preserve">Sur la base des statistiques descriptives par cluster, trois profils physiologiques distincts ont été identifiés :</w:t>
-      </w:r>
-    </w:p>
-    <w:p>
-      <w:pPr>
-        <w:pStyle w:val="BodyText"/>
-      </w:pPr>
-      <w:r>
         <w:t xml:space="preserve">Cluster 1 —</w:t>
       </w:r>
       <w:r>
@@ -10934,7 +10950,7 @@
         <w:t xml:space="preserve"> </w:t>
       </w:r>
       <w:r>
-        <w:t xml:space="preserve">: groupe majoritairement masculin (98.6%), caractérisé par la force de préhension la plus élevée (41.8 kg) mais la flexibilité la plus faible (2.98 cm).</w:t>
+        <w:t xml:space="preserve">: groupe majoritairement masculin (98.6%), caractérisé par la force de préhension la plus élevée (41.6 kg) mais la flexibilité la plus faible (2.93 cm).</w:t>
       </w:r>
       <w:r>
         <w:t xml:space="preserve"> </w:t>
@@ -10952,7 +10968,13 @@
         <w:t xml:space="preserve"> </w:t>
       </w:r>
       <w:r>
-        <w:t xml:space="preserve">: groupe quasi-exclusivement féminin (98%), présentant la masse grasse la plus élevée (56.9%), la force la plus faible (25.1 kg) et le VO₂ max le plus bas (31.3 ml/kg/min).</w:t>
+        <w:t xml:space="preserve">: groupe quasi-exclusivement féminin (98%), présentant la masse grasse la plus élevée (57.0%%) Cette valeur élevée s’explique par le fait que la winsorisation a plafonné les valeurs de percent_body_fat à Q3 + 1.5×IQR ≈ 60%, valeur qui correspond précisément au maximum observé pour les femmes dans ce dataset. La médiane du cluster 2 à 60% reflète donc une concentration naturelle des valeurs féminines autour de ce plafond biologique et non une anomalie du traitement.”</w:t>
+      </w:r>
+      <w:r>
+        <w:t xml:space="preserve"> </w:t>
+      </w:r>
+      <w:r>
+        <w:t xml:space="preserve">, la force la plus faible (25.1 kg) et le VO₂ max le plus bas (31.3 ml/kg/min).</w:t>
       </w:r>
       <w:r>
         <w:t xml:space="preserve"> </w:t>
@@ -10973,8 +10995,8 @@
         <w:t xml:space="preserve">: groupe majoritairement masculin (94.2%), affichant le meilleur VO₂ max (39.6 ml/kg/min) et la meilleure flexibilité (11.7 cm).”</w:t>
       </w:r>
     </w:p>
-    <w:bookmarkEnd w:id="114"/>
-    <w:bookmarkStart w:id="118" w:name="analyse-combinée-acp-et-clustering"/>
+    <w:bookmarkEnd w:id="116"/>
+    <w:bookmarkStart w:id="120" w:name="analyse-combinée-acp-et-clustering"/>
     <w:p>
       <w:pPr>
         <w:pStyle w:val="Heading1"/>
@@ -11155,18 +11177,18 @@
           <wp:inline>
             <wp:extent cx="5334000" cy="3333750"/>
             <wp:effectExtent b="0" l="0" r="0" t="0"/>
-            <wp:docPr descr="" title="" id="116" name="Picture"/>
+            <wp:docPr descr="" title="" id="118" name="Picture"/>
             <a:graphic>
               <a:graphicData uri="http://schemas.openxmlformats.org/drawingml/2006/picture">
                 <pic:pic>
                   <pic:nvPicPr>
-                    <pic:cNvPr descr="rapport_ameliore_files/rapport_ameliore_files/figure-docx/acp-clustering-1.png" id="117" name="Picture"/>
+                    <pic:cNvPr descr="rapport_ameliore_files/rapport_ameliore_files/figure-docx/acp-clustering-1.png" id="119" name="Picture"/>
                     <pic:cNvPicPr>
                       <a:picLocks noChangeArrowheads="1" noChangeAspect="1"/>
                     </pic:cNvPicPr>
                   </pic:nvPicPr>
                   <pic:blipFill>
-                    <a:blip r:embed="rId115"/>
+                    <a:blip r:embed="rId117"/>
                     <a:stretch>
                       <a:fillRect/>
                     </a:stretch>
@@ -11249,8 +11271,8 @@
         <w:t xml:space="preserve">Le Cluster 2 (vert) présente une dispersion verticale large, confirmant l’hétérogénéité de la flexibilité au sein du profil féminin</w:t>
       </w:r>
     </w:p>
-    <w:bookmarkEnd w:id="118"/>
-    <w:bookmarkStart w:id="119" w:name="complémentarité-des-deux-méthodes"/>
+    <w:bookmarkEnd w:id="120"/>
+    <w:bookmarkStart w:id="121" w:name="complémentarité-des-deux-méthodes"/>
     <w:p>
       <w:pPr>
         <w:pStyle w:val="Heading1"/>
@@ -11658,8 +11680,14 @@
       <w:r>
         <w:t xml:space="preserve">Ces résultats ouvrent la voie à des applications concrètes en santé publique, médecine du sport et programme de prévention, en offrant une base scientifique solide pour une prise en charge individualisée et adaptée à chaque profil physiologique.”</w:t>
       </w:r>
-    </w:p>
-    <w:bookmarkEnd w:id="119"/>
+      <w:r>
+        <w:t xml:space="preserve"> </w:t>
+      </w:r>
+      <w:r>
+        <w:t xml:space="preserve">À terme, l’intégration de variables comportementales (niveau d’activité déclaré, alimentation) et longitudinales (évolution dans le temps) permettrait d’enrichir cette analyse et de valider la stabilité des profils identifiés.</w:t>
+      </w:r>
+    </w:p>
+    <w:bookmarkEnd w:id="121"/>
     <w:sectPr>
       <w:footnotePr>
         <w:numRestart w:val="eachSect"/>

</xml_diff>